<commit_message>
feat(ca): implement Campus Ambassador application process, including submission, approval, and management of applications
</commit_message>
<xml_diff>
--- a/frontend/public/course-certificates/Airkrit Certificates/Airkrit India Offer Letter - Intern - AI-02453 - Template.docx
+++ b/frontend/public/course-certificates/Airkrit Certificates/Airkrit India Offer Letter - Intern - AI-02453 - Template.docx
@@ -607,7 +607,7 @@
                               </w:r>
                               <w:proofErr w:type="spellStart"/>
                               <w:r>
-                                <w:t>Edulyt</w:t>
+                                <w:t>Airkrit</w:t>
                               </w:r>
                               <w:proofErr w:type="spellEnd"/>
                               <w:r>
@@ -1477,7 +1477,7 @@
                         </w:r>
                         <w:proofErr w:type="spellStart"/>
                         <w:r>
-                          <w:t>Edulyt</w:t>
+                          <w:t>Airkrit</w:t>
                         </w:r>
                         <w:proofErr w:type="spellEnd"/>
                         <w:r>

</xml_diff>

<commit_message>
feat(ca): improve CA offer letter generation process with enhanced error handling and logging for better job management
</commit_message>
<xml_diff>
--- a/frontend/public/course-certificates/Airkrit Certificates/Airkrit India Offer Letter - Intern - AI-02453 - Template.docx
+++ b/frontend/public/course-certificates/Airkrit Certificates/Airkrit India Offer Letter - Intern - AI-02453 - Template.docx
@@ -497,7 +497,7 @@
                         <wps:spPr>
                           <a:xfrm>
                             <a:off x="0" y="67600"/>
-                            <a:ext cx="1099820" cy="171450"/>
+                            <a:ext cx="2600000" cy="171450"/>
                           </a:xfrm>
                           <a:prstGeom prst="rect">
                             <a:avLst/>
@@ -568,7 +568,7 @@
                             </w:p>
                           </w:txbxContent>
                         </wps:txbx>
-                        <wps:bodyPr wrap="square" lIns="0" tIns="0" rIns="0" bIns="0" rtlCol="0">
+                        <wps:bodyPr wrap="none" lIns="0" tIns="0" rIns="0" bIns="0" rtlCol="0">
                           <a:noAutofit/>
                         </wps:bodyPr>
                       </wps:wsp>
@@ -1386,7 +1386,7 @@
                   <v:stroke joinstyle="miter"/>
                   <v:path gradientshapeok="t" o:connecttype="rect"/>
                 </v:shapetype>
-                <v:shape id="Textbox 5" o:spid="_x0000_s1028" type="#_x0000_t202" style="position:absolute;top:676;width:10998;height:1714;visibility:visible;mso-wrap-style:square;v-text-anchor:top" o:gfxdata="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" filled="f" stroked="f">
+                <v:shape id="Textbox 5" o:spid="_x0000_s1028" type="#_x0000_t202" style="position:absolute;top:676;width:26000;height:1714;visibility:visible;mso-wrap-style:none;v-text-anchor:top" o:gfxdata="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" filled="f" stroked="f">
                   <v:textbox inset="0,0,0,0">
                     <w:txbxContent>
                       <w:p>

</xml_diff>